<commit_message>
added log for sprint4 hermelink
added log4 to hermelink log for sprint 4
</commit_message>
<xml_diff>
--- a/Templates/Log/Hermelink_Log_01.docx
+++ b/Templates/Log/Hermelink_Log_01.docx
@@ -957,15 +957,7 @@
           <w:b/>
           <w:bCs/>
         </w:rPr>
-        <w:t xml:space="preserve"> </w:t>
-      </w:r>
-      <w:proofErr w:type="spellStart"/>
-      <w:r>
-        <w:rPr>
-          <w:b/>
-          <w:bCs/>
-        </w:rPr>
-        <w:t>StandUp</w:t>
+        <w:t xml:space="preserve"> StandUp</w:t>
       </w:r>
       <w:r>
         <w:rPr>
@@ -974,7 +966,6 @@
         </w:rPr>
         <w:t>s</w:t>
       </w:r>
-      <w:proofErr w:type="spellEnd"/>
       <w:r>
         <w:rPr>
           <w:b/>
@@ -1406,23 +1397,7 @@
           <w:i/>
           <w:iCs/>
         </w:rPr>
-        <w:t xml:space="preserve">[Welke onderdelen/taken wil je volgende werkdag weer oppakken/ ook te gebruiken voor je volgende Daily </w:t>
-      </w:r>
-      <w:proofErr w:type="spellStart"/>
-      <w:r>
-        <w:rPr>
-          <w:i/>
-          <w:iCs/>
-        </w:rPr>
-        <w:t>standUp</w:t>
-      </w:r>
-      <w:proofErr w:type="spellEnd"/>
-      <w:r>
-        <w:rPr>
-          <w:i/>
-          <w:iCs/>
-        </w:rPr>
-        <w:t>?]</w:t>
+        <w:t>[Welke onderdelen/taken wil je volgende werkdag weer oppakken/ ook te gebruiken voor je volgende Daily standUp?]</w:t>
       </w:r>
     </w:p>
     <w:p>
@@ -1503,15 +1478,7 @@
           <w:b/>
           <w:bCs/>
         </w:rPr>
-        <w:t xml:space="preserve"> </w:t>
-      </w:r>
-      <w:proofErr w:type="spellStart"/>
-      <w:r>
-        <w:rPr>
-          <w:b/>
-          <w:bCs/>
-        </w:rPr>
-        <w:t>StandUp</w:t>
+        <w:t xml:space="preserve"> StandUp</w:t>
       </w:r>
       <w:r>
         <w:rPr>
@@ -1520,7 +1487,6 @@
         </w:rPr>
         <w:t>s</w:t>
       </w:r>
-      <w:proofErr w:type="spellEnd"/>
       <w:r>
         <w:rPr>
           <w:b/>
@@ -1821,23 +1787,7 @@
           <w:i/>
           <w:iCs/>
         </w:rPr>
-        <w:t xml:space="preserve">In sprint 1 is er veel bereikt voor design, denk hierbij aan een </w:t>
-      </w:r>
-      <w:proofErr w:type="gramStart"/>
-      <w:r>
-        <w:rPr>
-          <w:i/>
-          <w:iCs/>
-        </w:rPr>
-        <w:t>OWASP onderzoek</w:t>
-      </w:r>
-      <w:proofErr w:type="gramEnd"/>
-      <w:r>
-        <w:rPr>
-          <w:i/>
-          <w:iCs/>
-        </w:rPr>
-        <w:t xml:space="preserve"> die ik kan gebruiken voor een portfolio item</w:t>
+        <w:t>In sprint 1 is er veel bereikt voor design, denk hierbij aan een OWASP onderzoek die ik kan gebruiken voor een portfolio item</w:t>
       </w:r>
       <w:r>
         <w:rPr>
@@ -1920,39 +1870,7 @@
           <w:i/>
           <w:iCs/>
         </w:rPr>
-        <w:t xml:space="preserve">deze week heb ik geleerd hoe je </w:t>
-      </w:r>
-      <w:proofErr w:type="gramStart"/>
-      <w:r>
-        <w:rPr>
-          <w:i/>
-          <w:iCs/>
-        </w:rPr>
-        <w:t>conform</w:t>
-      </w:r>
-      <w:proofErr w:type="gramEnd"/>
-      <w:r>
-        <w:rPr>
-          <w:i/>
-          <w:iCs/>
-        </w:rPr>
-        <w:t xml:space="preserve"> het sjabloon van OWASP het </w:t>
-      </w:r>
-      <w:proofErr w:type="spellStart"/>
-      <w:r>
-        <w:rPr>
-          <w:i/>
-          <w:iCs/>
-        </w:rPr>
-        <w:t>owasp</w:t>
-      </w:r>
-      <w:proofErr w:type="spellEnd"/>
-      <w:r>
-        <w:rPr>
-          <w:i/>
-          <w:iCs/>
-        </w:rPr>
-        <w:t>-onderzoek goed uitvoert</w:t>
+        <w:t>deze week heb ik geleerd hoe je conform het sjabloon van OWASP het owasp-onderzoek goed uitvoert</w:t>
       </w:r>
       <w:r>
         <w:rPr>
@@ -1991,21 +1909,12 @@
         </w:rPr>
         <w:br/>
       </w:r>
-      <w:proofErr w:type="gramStart"/>
-      <w:r>
-        <w:rPr>
-          <w:i/>
-          <w:iCs/>
-        </w:rPr>
-        <w:t>voor</w:t>
-      </w:r>
-      <w:proofErr w:type="gramEnd"/>
-      <w:r>
-        <w:rPr>
-          <w:i/>
-          <w:iCs/>
-        </w:rPr>
-        <w:t xml:space="preserve"> deze week zijn er geen vragen</w:t>
+      <w:r>
+        <w:rPr>
+          <w:i/>
+          <w:iCs/>
+        </w:rPr>
+        <w:t>voor deze week zijn er geen vragen</w:t>
       </w:r>
       <w:r>
         <w:rPr>
@@ -2061,37 +1970,12 @@
         </w:rPr>
         <w:br/>
       </w:r>
-      <w:proofErr w:type="spellStart"/>
-      <w:r>
-        <w:rPr>
-          <w:i/>
-          <w:iCs/>
-        </w:rPr>
-        <w:t>Jorick</w:t>
-      </w:r>
-      <w:proofErr w:type="spellEnd"/>
-      <w:r>
-        <w:rPr>
-          <w:i/>
-          <w:iCs/>
-        </w:rPr>
-        <w:t xml:space="preserve">: goed de punten in </w:t>
-      </w:r>
-      <w:proofErr w:type="spellStart"/>
-      <w:r>
-        <w:rPr>
-          <w:i/>
-          <w:iCs/>
-        </w:rPr>
-        <w:t>gdd</w:t>
-      </w:r>
-      <w:proofErr w:type="spellEnd"/>
-      <w:r>
-        <w:rPr>
-          <w:i/>
-          <w:iCs/>
-        </w:rPr>
-        <w:t xml:space="preserve"> genoteerd</w:t>
+      <w:r>
+        <w:rPr>
+          <w:i/>
+          <w:iCs/>
+        </w:rPr>
+        <w:t>Jorick: goed de punten in gdd genoteerd</w:t>
       </w:r>
     </w:p>
     <w:p>
@@ -2154,21 +2038,12 @@
         </w:rPr>
         <w:br/>
       </w:r>
-      <w:proofErr w:type="gramStart"/>
-      <w:r>
-        <w:rPr>
-          <w:i/>
-          <w:iCs/>
-        </w:rPr>
-        <w:t>voor</w:t>
-      </w:r>
-      <w:proofErr w:type="gramEnd"/>
-      <w:r>
-        <w:rPr>
-          <w:i/>
-          <w:iCs/>
-        </w:rPr>
-        <w:t xml:space="preserve"> volgende sprint is het handig om meer te overleggen over de taken</w:t>
+      <w:r>
+        <w:rPr>
+          <w:i/>
+          <w:iCs/>
+        </w:rPr>
+        <w:t>voor volgende sprint is het handig om meer te overleggen over de taken</w:t>
       </w:r>
       <w:r>
         <w:rPr>
@@ -2200,21 +2075,12 @@
         </w:rPr>
         <w:br/>
       </w:r>
-      <w:proofErr w:type="gramStart"/>
-      <w:r>
-        <w:rPr>
-          <w:i/>
-          <w:iCs/>
-        </w:rPr>
-        <w:t>deze</w:t>
-      </w:r>
-      <w:proofErr w:type="gramEnd"/>
-      <w:r>
-        <w:rPr>
-          <w:i/>
-          <w:iCs/>
-        </w:rPr>
-        <w:t xml:space="preserve"> sprint ging in het begin wat lastiger omdat wij eerst zijn begonnen met het maken van het project, en daarna hebben we pas gekeken welke examen kerntaken we voor wouden oefenen waardoor we toch net iets andere dingen deden dan dat we origineel hadden bedacht.</w:t>
+      <w:r>
+        <w:rPr>
+          <w:i/>
+          <w:iCs/>
+        </w:rPr>
+        <w:t>deze sprint ging in het begin wat lastiger omdat wij eerst zijn begonnen met het maken van het project, en daarna hebben we pas gekeken welke examen kerntaken we voor wouden oefenen waardoor we toch net iets andere dingen deden dan dat we origineel hadden bedacht.</w:t>
       </w:r>
       <w:r>
         <w:rPr>
@@ -2264,69 +2130,12 @@
         </w:rPr>
         <w:br/>
       </w:r>
-      <w:proofErr w:type="gramStart"/>
-      <w:r>
-        <w:rPr>
-          <w:i/>
-          <w:iCs/>
-        </w:rPr>
-        <w:t>de</w:t>
-      </w:r>
-      <w:proofErr w:type="gramEnd"/>
-      <w:r>
-        <w:rPr>
-          <w:i/>
-          <w:iCs/>
-        </w:rPr>
-        <w:t xml:space="preserve"> volgende sprint moeten we iets uitgebreide </w:t>
-      </w:r>
-      <w:proofErr w:type="spellStart"/>
-      <w:r>
-        <w:rPr>
-          <w:i/>
-          <w:iCs/>
-        </w:rPr>
-        <w:t>standups</w:t>
-      </w:r>
-      <w:proofErr w:type="spellEnd"/>
-      <w:r>
-        <w:rPr>
-          <w:i/>
-          <w:iCs/>
-        </w:rPr>
-        <w:t xml:space="preserve"> plaatsen, en eventueel mondeling nog de </w:t>
-      </w:r>
-      <w:proofErr w:type="spellStart"/>
-      <w:r>
-        <w:rPr>
-          <w:i/>
-          <w:iCs/>
-        </w:rPr>
-        <w:t>standup</w:t>
-      </w:r>
-      <w:proofErr w:type="spellEnd"/>
-      <w:r>
-        <w:rPr>
-          <w:i/>
-          <w:iCs/>
-        </w:rPr>
-        <w:t xml:space="preserve"> bespreken als er </w:t>
-      </w:r>
-      <w:proofErr w:type="spellStart"/>
-      <w:r>
-        <w:rPr>
-          <w:i/>
-          <w:iCs/>
-        </w:rPr>
-        <w:t>belangerijke</w:t>
-      </w:r>
-      <w:proofErr w:type="spellEnd"/>
-      <w:r>
-        <w:rPr>
-          <w:i/>
-          <w:iCs/>
-        </w:rPr>
-        <w:t xml:space="preserve"> zaken zijn.</w:t>
+      <w:r>
+        <w:rPr>
+          <w:i/>
+          <w:iCs/>
+        </w:rPr>
+        <w:t>de volgende sprint moeten we iets uitgebreide standups plaatsen, en eventueel mondeling nog de standup bespreken als er belangerijke zaken zijn.</w:t>
       </w:r>
     </w:p>
     <w:p>
@@ -2404,15 +2213,7 @@
           <w:b/>
           <w:bCs/>
         </w:rPr>
-        <w:t xml:space="preserve"> </w:t>
-      </w:r>
-      <w:proofErr w:type="spellStart"/>
-      <w:r>
-        <w:rPr>
-          <w:b/>
-          <w:bCs/>
-        </w:rPr>
-        <w:t>StandUp</w:t>
+        <w:t xml:space="preserve"> StandUp</w:t>
       </w:r>
       <w:r>
         <w:rPr>
@@ -2421,7 +2222,6 @@
         </w:rPr>
         <w:t>s</w:t>
       </w:r>
-      <w:proofErr w:type="spellEnd"/>
       <w:r>
         <w:rPr>
           <w:b/>
@@ -2702,69 +2502,12 @@
         </w:rPr>
         <w:br/>
       </w:r>
-      <w:proofErr w:type="gramStart"/>
-      <w:r>
-        <w:rPr>
-          <w:i/>
-          <w:iCs/>
-        </w:rPr>
-        <w:t>in</w:t>
-      </w:r>
-      <w:proofErr w:type="gramEnd"/>
-      <w:r>
-        <w:rPr>
-          <w:i/>
-          <w:iCs/>
-        </w:rPr>
-        <w:t xml:space="preserve"> sprint 1 hebben we veel design elementen van het project verwerkt, denk hierbij aan art en </w:t>
-      </w:r>
-      <w:proofErr w:type="spellStart"/>
-      <w:r>
-        <w:rPr>
-          <w:i/>
-          <w:iCs/>
-        </w:rPr>
-        <w:t>sprites</w:t>
-      </w:r>
-      <w:proofErr w:type="spellEnd"/>
-      <w:r>
-        <w:rPr>
-          <w:i/>
-          <w:iCs/>
-        </w:rPr>
-        <w:t xml:space="preserve">, </w:t>
-      </w:r>
-      <w:proofErr w:type="spellStart"/>
-      <w:r>
-        <w:rPr>
-          <w:i/>
-          <w:iCs/>
-        </w:rPr>
-        <w:t>gdd</w:t>
-      </w:r>
-      <w:proofErr w:type="spellEnd"/>
-      <w:r>
-        <w:rPr>
-          <w:i/>
-          <w:iCs/>
-        </w:rPr>
-        <w:t xml:space="preserve"> en </w:t>
-      </w:r>
-      <w:proofErr w:type="spellStart"/>
-      <w:r>
-        <w:rPr>
-          <w:i/>
-          <w:iCs/>
-        </w:rPr>
-        <w:t>userstories</w:t>
-      </w:r>
-      <w:proofErr w:type="spellEnd"/>
-      <w:r>
-        <w:rPr>
-          <w:i/>
-          <w:iCs/>
-        </w:rPr>
-        <w:t xml:space="preserve"> die wij gebruikten om het eerste prototype te maken voor sprint 1.</w:t>
+      <w:r>
+        <w:rPr>
+          <w:i/>
+          <w:iCs/>
+        </w:rPr>
+        <w:t>in sprint 1 hebben we veel design elementen van het project verwerkt, denk hierbij aan art en sprites, gdd en userstories die wij gebruikten om het eerste prototype te maken voor sprint 1.</w:t>
       </w:r>
     </w:p>
     <w:p>
@@ -2779,79 +2522,7 @@
         <w:ind w:left="360"/>
       </w:pPr>
       <w:r>
-        <w:t xml:space="preserve">Daarnaast hebben we een begin gemaakt aan het </w:t>
-      </w:r>
-      <w:proofErr w:type="spellStart"/>
-      <w:r>
-        <w:t>unity</w:t>
-      </w:r>
-      <w:proofErr w:type="spellEnd"/>
-      <w:r>
-        <w:t xml:space="preserve"> project, er zijn verschillende </w:t>
-      </w:r>
-      <w:proofErr w:type="spellStart"/>
-      <w:r>
-        <w:t>mechanics</w:t>
-      </w:r>
-      <w:proofErr w:type="spellEnd"/>
-      <w:r>
-        <w:t xml:space="preserve"> al werkend, denk aan </w:t>
-      </w:r>
-      <w:proofErr w:type="spellStart"/>
-      <w:r>
-        <w:t>player</w:t>
-      </w:r>
-      <w:proofErr w:type="spellEnd"/>
-      <w:r>
-        <w:t xml:space="preserve"> </w:t>
-      </w:r>
-      <w:proofErr w:type="spellStart"/>
-      <w:r>
-        <w:t>movement</w:t>
-      </w:r>
-      <w:proofErr w:type="spellEnd"/>
-      <w:r>
-        <w:t xml:space="preserve">, </w:t>
-      </w:r>
-      <w:proofErr w:type="spellStart"/>
-      <w:r>
-        <w:t>playerhealth</w:t>
-      </w:r>
-      <w:proofErr w:type="spellEnd"/>
-      <w:r>
-        <w:t xml:space="preserve">, map en </w:t>
-      </w:r>
-      <w:proofErr w:type="spellStart"/>
-      <w:r>
-        <w:t>obstacle</w:t>
-      </w:r>
-      <w:proofErr w:type="spellEnd"/>
-      <w:r>
-        <w:t xml:space="preserve"> </w:t>
-      </w:r>
-      <w:proofErr w:type="spellStart"/>
-      <w:r>
-        <w:t>generation</w:t>
-      </w:r>
-      <w:proofErr w:type="spellEnd"/>
-      <w:r>
-        <w:t xml:space="preserve"> en paar kleine dingen meer zoals </w:t>
-      </w:r>
-      <w:proofErr w:type="spellStart"/>
-      <w:r>
-        <w:t>enemies</w:t>
-      </w:r>
-      <w:proofErr w:type="spellEnd"/>
-      <w:r>
-        <w:t xml:space="preserve"> en </w:t>
-      </w:r>
-      <w:proofErr w:type="spellStart"/>
-      <w:r>
-        <w:t>damage</w:t>
-      </w:r>
-      <w:proofErr w:type="spellEnd"/>
-      <w:r>
-        <w:t>, hier is al een begin aan gemaakt.</w:t>
+        <w:t>Daarnaast hebben we een begin gemaakt aan het unity project, er zijn verschillende mechanics al werkend, denk aan player movement, playerhealth, map en obstacle generation en paar kleine dingen meer zoals enemies en damage, hier is al een begin aan gemaakt.</w:t>
       </w:r>
       <w:r>
         <w:rPr>
@@ -2888,23 +2559,7 @@
           <w:i/>
           <w:iCs/>
         </w:rPr>
-        <w:t xml:space="preserve">een mogelijke uitdaging die ik wel heb ervaren is dat mijn collega (kort) moest uitleggen wat mijn code deed, helaas was ik vergeten mijn script goed te </w:t>
-      </w:r>
-      <w:proofErr w:type="spellStart"/>
-      <w:r>
-        <w:rPr>
-          <w:i/>
-          <w:iCs/>
-        </w:rPr>
-        <w:t>commenten</w:t>
-      </w:r>
-      <w:proofErr w:type="spellEnd"/>
-      <w:r>
-        <w:rPr>
-          <w:i/>
-          <w:iCs/>
-        </w:rPr>
-        <w:t xml:space="preserve"> dus moest ik het mondelings uitleggen.</w:t>
+        <w:t>een mogelijke uitdaging die ik wel heb ervaren is dat mijn collega (kort) moest uitleggen wat mijn code deed, helaas was ik vergeten mijn script goed te commenten dus moest ik het mondelings uitleggen.</w:t>
       </w:r>
     </w:p>
     <w:p>
@@ -2913,15 +2568,7 @@
         <w:ind w:left="360"/>
       </w:pPr>
       <w:r>
-        <w:t xml:space="preserve">Natuurlijk kan dit opgelost worden door mijn code wat beter te </w:t>
-      </w:r>
-      <w:proofErr w:type="spellStart"/>
-      <w:r>
-        <w:t>commenten</w:t>
-      </w:r>
-      <w:proofErr w:type="spellEnd"/>
-      <w:r>
-        <w:t xml:space="preserve"> zodat ook mijn collega weet wat er gebeurt in het script.</w:t>
+        <w:t>Natuurlijk kan dit opgelost worden door mijn code wat beter te commenten zodat ook mijn collega weet wat er gebeurt in het script.</w:t>
       </w:r>
       <w:r>
         <w:rPr>
@@ -2989,21 +2636,12 @@
         </w:rPr>
         <w:br/>
       </w:r>
-      <w:proofErr w:type="gramStart"/>
-      <w:r>
-        <w:rPr>
-          <w:i/>
-          <w:iCs/>
-        </w:rPr>
-        <w:t>er</w:t>
-      </w:r>
-      <w:proofErr w:type="gramEnd"/>
-      <w:r>
-        <w:rPr>
-          <w:i/>
-          <w:iCs/>
-        </w:rPr>
-        <w:t xml:space="preserve"> zijn voor de volgende sprint geen onduidelijkheden </w:t>
+      <w:r>
+        <w:rPr>
+          <w:i/>
+          <w:iCs/>
+        </w:rPr>
+        <w:t xml:space="preserve">er zijn voor de volgende sprint geen onduidelijkheden </w:t>
       </w:r>
       <w:r>
         <w:rPr>
@@ -3060,15 +2698,7 @@
         <w:br/>
       </w:r>
       <w:r>
-        <w:t xml:space="preserve">Jeroen: ik vind het goed om te zien dat </w:t>
-      </w:r>
-      <w:proofErr w:type="spellStart"/>
-      <w:r>
-        <w:t>jeroen</w:t>
-      </w:r>
-      <w:proofErr w:type="spellEnd"/>
-      <w:r>
-        <w:t xml:space="preserve"> druk bezig is met een goede planning maken.</w:t>
+        <w:t>Jeroen: ik vind het goed om te zien dat jeroen druk bezig is met een goede planning maken.</w:t>
       </w:r>
     </w:p>
     <w:p>
@@ -3081,15 +2711,7 @@
         </w:rPr>
       </w:pPr>
       <w:r>
-        <w:t xml:space="preserve">Gido: ik vind de art die is gemaakt passen bij het spel, daarnaast is er goed over de map </w:t>
-      </w:r>
-      <w:proofErr w:type="spellStart"/>
-      <w:r>
-        <w:t>layout</w:t>
-      </w:r>
-      <w:proofErr w:type="spellEnd"/>
-      <w:r>
-        <w:t xml:space="preserve"> na gedacht</w:t>
+        <w:t>Gido: ik vind de art die is gemaakt passen bij het spel, daarnaast is er goed over de map layout na gedacht</w:t>
       </w:r>
       <w:r>
         <w:rPr>
@@ -3139,21 +2761,12 @@
         </w:rPr>
         <w:br/>
       </w:r>
-      <w:proofErr w:type="gramStart"/>
-      <w:r>
-        <w:rPr>
-          <w:i/>
-          <w:iCs/>
-        </w:rPr>
-        <w:t>voor</w:t>
-      </w:r>
-      <w:proofErr w:type="gramEnd"/>
-      <w:r>
-        <w:rPr>
-          <w:i/>
-          <w:iCs/>
-        </w:rPr>
-        <w:t xml:space="preserve"> volgende sprint net iets beter vergaderingen/meetings plannen</w:t>
+      <w:r>
+        <w:rPr>
+          <w:i/>
+          <w:iCs/>
+        </w:rPr>
+        <w:t>voor volgende sprint net iets beter vergaderingen/meetings plannen</w:t>
       </w:r>
       <w:r>
         <w:rPr>
@@ -3185,37 +2798,12 @@
         </w:rPr>
         <w:br/>
       </w:r>
-      <w:proofErr w:type="gramStart"/>
-      <w:r>
-        <w:rPr>
-          <w:i/>
-          <w:iCs/>
-        </w:rPr>
-        <w:t>deze</w:t>
-      </w:r>
-      <w:proofErr w:type="gramEnd"/>
-      <w:r>
-        <w:rPr>
-          <w:i/>
-          <w:iCs/>
-        </w:rPr>
-        <w:t xml:space="preserve"> sprint was ik wat meer </w:t>
-      </w:r>
-      <w:proofErr w:type="spellStart"/>
-      <w:r>
-        <w:rPr>
-          <w:i/>
-          <w:iCs/>
-        </w:rPr>
-        <w:t>geirriteerd</w:t>
-      </w:r>
-      <w:proofErr w:type="spellEnd"/>
-      <w:r>
-        <w:rPr>
-          <w:i/>
-          <w:iCs/>
-        </w:rPr>
-        <w:t xml:space="preserve">, dit kwam doordat er steeds tussentijdse feedback kwam van een bepaalde docent waardoor wij de planning steeds moesten aanpassen en iedereen opeens wat anders moest doen waardoor wij niet goed konden focussen op prioriteiten. </w:t>
+      <w:r>
+        <w:rPr>
+          <w:i/>
+          <w:iCs/>
+        </w:rPr>
+        <w:t xml:space="preserve">deze sprint was ik wat meer geirriteerd, dit kwam doordat er steeds tussentijdse feedback kwam van een bepaalde docent waardoor wij de planning steeds moesten aanpassen en iedereen opeens wat anders moest doen waardoor wij niet goed konden focussen op prioriteiten. </w:t>
       </w:r>
     </w:p>
     <w:p>
@@ -3271,85 +2859,12 @@
         </w:rPr>
         <w:br/>
       </w:r>
-      <w:proofErr w:type="gramStart"/>
-      <w:r>
-        <w:rPr>
-          <w:i/>
-          <w:iCs/>
-        </w:rPr>
-        <w:t>voor</w:t>
-      </w:r>
-      <w:proofErr w:type="gramEnd"/>
-      <w:r>
-        <w:rPr>
-          <w:i/>
-          <w:iCs/>
-        </w:rPr>
-        <w:t xml:space="preserve"> volgende sprint wil ik graag het </w:t>
-      </w:r>
-      <w:proofErr w:type="spellStart"/>
-      <w:r>
-        <w:rPr>
-          <w:i/>
-          <w:iCs/>
-        </w:rPr>
-        <w:t>gdd</w:t>
-      </w:r>
-      <w:proofErr w:type="spellEnd"/>
-      <w:r>
-        <w:rPr>
-          <w:i/>
-          <w:iCs/>
-        </w:rPr>
-        <w:t xml:space="preserve"> v2 voor mijn portfolio afmaken, daarnaast wil ik meer </w:t>
-      </w:r>
-      <w:proofErr w:type="spellStart"/>
-      <w:r>
-        <w:rPr>
-          <w:i/>
-          <w:iCs/>
-        </w:rPr>
-        <w:t>enemies</w:t>
-      </w:r>
-      <w:proofErr w:type="spellEnd"/>
-      <w:r>
-        <w:rPr>
-          <w:i/>
-          <w:iCs/>
-        </w:rPr>
-        <w:t xml:space="preserve"> zoals </w:t>
-      </w:r>
-      <w:proofErr w:type="spellStart"/>
-      <w:r>
-        <w:rPr>
-          <w:i/>
-          <w:iCs/>
-        </w:rPr>
-        <w:t>turrets</w:t>
-      </w:r>
-      <w:proofErr w:type="spellEnd"/>
-      <w:r>
-        <w:rPr>
-          <w:i/>
-          <w:iCs/>
-        </w:rPr>
-        <w:t xml:space="preserve">, </w:t>
-      </w:r>
-      <w:proofErr w:type="spellStart"/>
-      <w:r>
-        <w:rPr>
-          <w:i/>
-          <w:iCs/>
-        </w:rPr>
-        <w:t>obstacles</w:t>
-      </w:r>
-      <w:proofErr w:type="spellEnd"/>
-      <w:r>
-        <w:rPr>
-          <w:i/>
-          <w:iCs/>
-        </w:rPr>
-        <w:t xml:space="preserve"> en meer maken.</w:t>
+      <w:r>
+        <w:rPr>
+          <w:i/>
+          <w:iCs/>
+        </w:rPr>
+        <w:t>voor volgende sprint wil ik graag het gdd v2 voor mijn portfolio afmaken, daarnaast wil ik meer enemies zoals turrets, obstacles en meer maken.</w:t>
       </w:r>
     </w:p>
     <w:p>
@@ -3427,15 +2942,7 @@
           <w:b/>
           <w:bCs/>
         </w:rPr>
-        <w:t xml:space="preserve"> </w:t>
-      </w:r>
-      <w:proofErr w:type="spellStart"/>
-      <w:r>
-        <w:rPr>
-          <w:b/>
-          <w:bCs/>
-        </w:rPr>
-        <w:t>StandUp</w:t>
+        <w:t xml:space="preserve"> StandUp</w:t>
       </w:r>
       <w:r>
         <w:rPr>
@@ -3444,7 +2951,6 @@
         </w:rPr>
         <w:t>s</w:t>
       </w:r>
-      <w:proofErr w:type="spellEnd"/>
       <w:r>
         <w:rPr>
           <w:b/>
@@ -3459,7 +2965,6 @@
         </w:rPr>
         <w:br/>
       </w:r>
-      <w:proofErr w:type="gramStart"/>
       <w:r>
         <w:rPr>
           <w:i/>
@@ -3472,15 +2977,7 @@
           <w:i/>
           <w:iCs/>
         </w:rPr>
-        <w:t>g</w:t>
-      </w:r>
-      <w:proofErr w:type="gramEnd"/>
-      <w:r>
-        <w:rPr>
-          <w:i/>
-          <w:iCs/>
-        </w:rPr>
-        <w:t xml:space="preserve"> waren wij vrij*</w:t>
+        <w:t>g waren wij vrij*</w:t>
       </w:r>
     </w:p>
     <w:p>
@@ -3492,6 +2989,7 @@
         <w:rPr>
           <w:i/>
           <w:iCs/>
+          <w:noProof/>
         </w:rPr>
         <w:drawing>
           <wp:inline distT="0" distB="0" distL="0" distR="0" wp14:anchorId="65159BAB" wp14:editId="211068E3">
@@ -3537,6 +3035,9 @@
         <w:br/>
       </w:r>
       <w:r>
+        <w:rPr>
+          <w:noProof/>
+        </w:rPr>
         <w:drawing>
           <wp:inline distT="0" distB="0" distL="0" distR="0" wp14:anchorId="5B694150" wp14:editId="21C1A799">
             <wp:extent cx="3329940" cy="1529160"/>
@@ -3586,6 +3087,9 @@
         <w:ind w:left="360"/>
       </w:pPr>
       <w:r>
+        <w:rPr>
+          <w:noProof/>
+        </w:rPr>
         <w:drawing>
           <wp:inline distT="0" distB="0" distL="0" distR="0" wp14:anchorId="403BDEC6" wp14:editId="5F5B56DD">
             <wp:extent cx="2689860" cy="1939470"/>
@@ -3629,6 +3133,9 @@
         <w:ind w:left="360"/>
       </w:pPr>
       <w:r>
+        <w:rPr>
+          <w:noProof/>
+        </w:rPr>
         <w:drawing>
           <wp:inline distT="0" distB="0" distL="0" distR="0" wp14:anchorId="1305C7EE" wp14:editId="311D028E">
             <wp:extent cx="2147968" cy="2263140"/>
@@ -3710,108 +3217,26 @@
         </w:rPr>
         <w:br/>
       </w:r>
-      <w:proofErr w:type="gramStart"/>
-      <w:r>
-        <w:rPr>
-          <w:i/>
-          <w:iCs/>
-        </w:rPr>
-        <w:t>in</w:t>
-      </w:r>
-      <w:proofErr w:type="gramEnd"/>
-      <w:r>
-        <w:rPr>
-          <w:i/>
-          <w:iCs/>
-        </w:rPr>
-        <w:t xml:space="preserve"> sprint 3 zijn wij begonnen met het verbeteren van de functionaliteit van het gehele spel, wij zijn bezig geweest met nieuwe </w:t>
-      </w:r>
-      <w:proofErr w:type="spellStart"/>
-      <w:r>
-        <w:rPr>
-          <w:i/>
-          <w:iCs/>
-        </w:rPr>
-        <w:t>enemies</w:t>
-      </w:r>
-      <w:proofErr w:type="spellEnd"/>
-      <w:r>
-        <w:rPr>
-          <w:i/>
-          <w:iCs/>
-        </w:rPr>
-        <w:t xml:space="preserve"> toevoegen, </w:t>
-      </w:r>
-      <w:r>
-        <w:rPr>
-          <w:i/>
-          <w:iCs/>
-        </w:rPr>
-        <w:t xml:space="preserve">werkend krijgen van de </w:t>
-      </w:r>
-      <w:proofErr w:type="spellStart"/>
-      <w:r>
-        <w:rPr>
-          <w:i/>
-          <w:iCs/>
-        </w:rPr>
-        <w:t>debuffs</w:t>
-      </w:r>
-      <w:proofErr w:type="spellEnd"/>
-      <w:r>
-        <w:rPr>
-          <w:i/>
-          <w:iCs/>
-        </w:rPr>
-        <w:t xml:space="preserve"> en </w:t>
-      </w:r>
-      <w:proofErr w:type="spellStart"/>
-      <w:r>
-        <w:rPr>
-          <w:i/>
-          <w:iCs/>
-        </w:rPr>
-        <w:t>powerups</w:t>
-      </w:r>
-      <w:proofErr w:type="spellEnd"/>
-      <w:r>
-        <w:rPr>
-          <w:i/>
-          <w:iCs/>
-        </w:rPr>
-        <w:t xml:space="preserve">. Hierdoor hebben wij een behoorlijke sprong kunnen maken voor ons </w:t>
-      </w:r>
-      <w:proofErr w:type="spellStart"/>
-      <w:r>
-        <w:rPr>
-          <w:i/>
-          <w:iCs/>
-        </w:rPr>
-        <w:t>unique</w:t>
-      </w:r>
-      <w:proofErr w:type="spellEnd"/>
-      <w:r>
-        <w:rPr>
-          <w:i/>
-          <w:iCs/>
-        </w:rPr>
-        <w:t xml:space="preserve"> </w:t>
-      </w:r>
-      <w:proofErr w:type="spellStart"/>
-      <w:r>
-        <w:rPr>
-          <w:i/>
-          <w:iCs/>
-        </w:rPr>
-        <w:t>selling</w:t>
-      </w:r>
-      <w:proofErr w:type="spellEnd"/>
-      <w:r>
-        <w:rPr>
-          <w:i/>
-          <w:iCs/>
-        </w:rPr>
-        <w:t xml:space="preserve"> point deel van het spel.</w:t>
+      <w:r>
+        <w:rPr>
+          <w:i/>
+          <w:iCs/>
+        </w:rPr>
+        <w:t xml:space="preserve">in sprint 3 zijn wij begonnen met het verbeteren van de functionaliteit van het gehele spel, wij zijn bezig geweest met nieuwe enemies toevoegen, </w:t>
+      </w:r>
+      <w:r>
+        <w:rPr>
+          <w:i/>
+          <w:iCs/>
+        </w:rPr>
+        <w:t>werkend krijgen van de debuffs</w:t>
+      </w:r>
+      <w:r>
+        <w:rPr>
+          <w:i/>
+          <w:iCs/>
+        </w:rPr>
+        <w:t xml:space="preserve"> en powerups. Hierdoor hebben wij een behoorlijke sprong kunnen maken voor ons unique selling point deel van het spel.</w:t>
       </w:r>
       <w:r>
         <w:rPr>
@@ -3847,23 +3272,7 @@
           <w:i/>
           <w:iCs/>
         </w:rPr>
-        <w:t xml:space="preserve">Een mogelijke uitdaging die wij kunnen tegenkomen is het limiet van obstakels niet goed uitplannen, hierdoor kan het zijn dat wij </w:t>
-      </w:r>
-      <w:proofErr w:type="gramStart"/>
-      <w:r>
-        <w:rPr>
-          <w:i/>
-          <w:iCs/>
-        </w:rPr>
-        <w:t>teveel</w:t>
-      </w:r>
-      <w:proofErr w:type="gramEnd"/>
-      <w:r>
-        <w:rPr>
-          <w:i/>
-          <w:iCs/>
-        </w:rPr>
-        <w:t xml:space="preserve"> obstakels maken waardoor er minder tijd is voor hogere prioriteit taken. Een oplossing is dat wij ons aan de ingeplande tijd houden, en voor het volgende prototype niet te veel inplannen.</w:t>
+        <w:t>Een mogelijke uitdaging die wij kunnen tegenkomen is het limiet van obstakels niet goed uitplannen, hierdoor kan het zijn dat wij teveel obstakels maken waardoor er minder tijd is voor hogere prioriteit taken. Een oplossing is dat wij ons aan de ingeplande tijd houden, en voor het volgende prototype niet te veel inplannen.</w:t>
       </w:r>
       <w:r>
         <w:rPr>
@@ -3900,23 +3309,7 @@
           <w:i/>
           <w:iCs/>
         </w:rPr>
-        <w:t xml:space="preserve">deze sprint heb ik mijn </w:t>
-      </w:r>
-      <w:proofErr w:type="gramStart"/>
-      <w:r>
-        <w:rPr>
-          <w:i/>
-          <w:iCs/>
-        </w:rPr>
-        <w:t>UML kennis</w:t>
-      </w:r>
-      <w:proofErr w:type="gramEnd"/>
-      <w:r>
-        <w:rPr>
-          <w:i/>
-          <w:iCs/>
-        </w:rPr>
-        <w:t xml:space="preserve"> weer bijgewerkt, hierdoor kan ik makkelijker diagrammen maken voor volgende sprints</w:t>
+        <w:t>deze sprint heb ik mijn UML kennis weer bijgewerkt, hierdoor kan ik makkelijker diagrammen maken voor volgende sprints</w:t>
       </w:r>
       <w:r>
         <w:rPr>
@@ -3948,21 +3341,12 @@
         </w:rPr>
         <w:br/>
       </w:r>
-      <w:proofErr w:type="gramStart"/>
-      <w:r>
-        <w:rPr>
-          <w:i/>
-          <w:iCs/>
-        </w:rPr>
-        <w:t>er</w:t>
-      </w:r>
-      <w:proofErr w:type="gramEnd"/>
-      <w:r>
-        <w:rPr>
-          <w:i/>
-          <w:iCs/>
-        </w:rPr>
-        <w:t xml:space="preserve"> was deze sprint wel een onduidelijkheid over of we nou 4 of 5 sprints gaan doen, maar dit was inmiddels al opgelost.</w:t>
+      <w:r>
+        <w:rPr>
+          <w:i/>
+          <w:iCs/>
+        </w:rPr>
+        <w:t>er was deze sprint wel een onduidelijkheid over of we nou 4 of 5 sprints gaan doen, maar dit was inmiddels al opgelost.</w:t>
       </w:r>
       <w:r>
         <w:rPr>
@@ -4018,37 +3402,12 @@
         </w:rPr>
         <w:br/>
       </w:r>
-      <w:proofErr w:type="spellStart"/>
-      <w:r>
-        <w:rPr>
-          <w:i/>
-          <w:iCs/>
-        </w:rPr>
-        <w:t>jeroen</w:t>
-      </w:r>
-      <w:proofErr w:type="spellEnd"/>
-      <w:r>
-        <w:rPr>
-          <w:i/>
-          <w:iCs/>
-        </w:rPr>
-        <w:t xml:space="preserve"> heeft goed de </w:t>
-      </w:r>
-      <w:proofErr w:type="spellStart"/>
-      <w:r>
-        <w:rPr>
-          <w:i/>
-          <w:iCs/>
-        </w:rPr>
-        <w:t>powerups</w:t>
-      </w:r>
-      <w:proofErr w:type="spellEnd"/>
-      <w:r>
-        <w:rPr>
-          <w:i/>
-          <w:iCs/>
-        </w:rPr>
-        <w:t xml:space="preserve"> gemaakt</w:t>
+      <w:r>
+        <w:rPr>
+          <w:i/>
+          <w:iCs/>
+        </w:rPr>
+        <w:t>jeroen heeft goed de powerups gemaakt</w:t>
       </w:r>
     </w:p>
     <w:p>
@@ -4111,21 +3470,12 @@
         </w:rPr>
         <w:br/>
       </w:r>
-      <w:proofErr w:type="gramStart"/>
-      <w:r>
-        <w:rPr>
-          <w:i/>
-          <w:iCs/>
-        </w:rPr>
-        <w:t>voor</w:t>
-      </w:r>
-      <w:proofErr w:type="gramEnd"/>
-      <w:r>
-        <w:rPr>
-          <w:i/>
-          <w:iCs/>
-        </w:rPr>
-        <w:t xml:space="preserve"> volgende sprint ga ik mijn taken iets overzichtelijker maken, denk hierbij aan het opzoeken welke obstakels er gemaakt moeten worden voor het volgende prototype</w:t>
+      <w:r>
+        <w:rPr>
+          <w:i/>
+          <w:iCs/>
+        </w:rPr>
+        <w:t>voor volgende sprint ga ik mijn taken iets overzichtelijker maken, denk hierbij aan het opzoeken welke obstakels er gemaakt moeten worden voor het volgende prototype</w:t>
       </w:r>
       <w:r>
         <w:rPr>
@@ -4157,13 +3507,8 @@
         <w:ind w:left="360"/>
       </w:pPr>
       <w:r>
-        <w:t xml:space="preserve">Deze sprint was ik wel goed aanwezig naar mijn gevoel, dit komt doordat ik geen momenten had waar ik totaal niks te doen had. Ik kon dus lekker </w:t>
-      </w:r>
-      <w:proofErr w:type="spellStart"/>
-      <w:r>
-        <w:t>verderwerken</w:t>
-      </w:r>
-      <w:proofErr w:type="spellEnd"/>
+        <w:t>Deze sprint was ik wel goed aanwezig naar mijn gevoel, dit komt doordat ik geen momenten had waar ik totaal niks te doen had. Ik kon dus lekker verderwerken</w:t>
+      </w:r>
       <w:r>
         <w:rPr>
           <w:b/>
@@ -4198,13 +3543,8 @@
         </w:rPr>
         <w:br/>
       </w:r>
-      <w:proofErr w:type="gramStart"/>
-      <w:r>
-        <w:t>voor</w:t>
-      </w:r>
-      <w:proofErr w:type="gramEnd"/>
-      <w:r>
-        <w:t xml:space="preserve"> de volgende sprint wil ik de obstakels simpeler programmeren, hiermee bedoel ik dat er meerdere scripts worden gemaakt voor verschillende obstakels waardoor het overzichtelijker word wat een script precies doet.</w:t>
+      <w:r>
+        <w:t>voor de volgende sprint wil ik de obstakels simpeler programmeren, hiermee bedoel ik dat er meerdere scripts worden gemaakt voor verschillende obstakels waardoor het overzichtelijker word wat een script precies doet.</w:t>
       </w:r>
     </w:p>
     <w:p>
@@ -4233,6 +3573,69 @@
       </w:pPr>
       <w:r>
         <w:rPr>
+          <w:i/>
+          <w:iCs/>
+        </w:rPr>
+        <w:drawing>
+          <wp:anchor distT="0" distB="0" distL="114300" distR="114300" simplePos="0" relativeHeight="251660289" behindDoc="0" locked="0" layoutInCell="1" allowOverlap="1" wp14:anchorId="46F090E9" wp14:editId="60B92B43">
+            <wp:simplePos x="0" y="0"/>
+            <wp:positionH relativeFrom="column">
+              <wp:posOffset>3405505</wp:posOffset>
+            </wp:positionH>
+            <wp:positionV relativeFrom="paragraph">
+              <wp:posOffset>294640</wp:posOffset>
+            </wp:positionV>
+            <wp:extent cx="3116580" cy="1508760"/>
+            <wp:effectExtent l="0" t="0" r="7620" b="0"/>
+            <wp:wrapThrough wrapText="bothSides">
+              <wp:wrapPolygon edited="0">
+                <wp:start x="0" y="0"/>
+                <wp:lineTo x="0" y="21273"/>
+                <wp:lineTo x="21521" y="21273"/>
+                <wp:lineTo x="21521" y="0"/>
+                <wp:lineTo x="0" y="0"/>
+              </wp:wrapPolygon>
+            </wp:wrapThrough>
+            <wp:docPr id="460064767" name="Picture 1" descr="A white text with black text&#10;&#10;AI-generated content may be incorrect."/>
+            <wp:cNvGraphicFramePr>
+              <a:graphicFrameLocks xmlns:a="http://schemas.openxmlformats.org/drawingml/2006/main" noChangeAspect="1"/>
+            </wp:cNvGraphicFramePr>
+            <a:graphic xmlns:a="http://schemas.openxmlformats.org/drawingml/2006/main">
+              <a:graphicData uri="http://schemas.openxmlformats.org/drawingml/2006/picture">
+                <pic:pic xmlns:pic="http://schemas.openxmlformats.org/drawingml/2006/picture">
+                  <pic:nvPicPr>
+                    <pic:cNvPr id="460064767" name="Picture 1" descr="A white text with black text&#10;&#10;AI-generated content may be incorrect."/>
+                    <pic:cNvPicPr/>
+                  </pic:nvPicPr>
+                  <pic:blipFill>
+                    <a:blip r:embed="rId25">
+                      <a:extLst>
+                        <a:ext uri="{28A0092B-C50C-407E-A947-70E740481C1C}">
+                          <a14:useLocalDpi xmlns:a14="http://schemas.microsoft.com/office/drawing/2010/main" val="0"/>
+                        </a:ext>
+                      </a:extLst>
+                    </a:blip>
+                    <a:stretch>
+                      <a:fillRect/>
+                    </a:stretch>
+                  </pic:blipFill>
+                  <pic:spPr>
+                    <a:xfrm>
+                      <a:off x="0" y="0"/>
+                      <a:ext cx="3116580" cy="1508760"/>
+                    </a:xfrm>
+                    <a:prstGeom prst="rect">
+                      <a:avLst/>
+                    </a:prstGeom>
+                  </pic:spPr>
+                </pic:pic>
+              </a:graphicData>
+            </a:graphic>
+          </wp:anchor>
+        </w:drawing>
+      </w:r>
+      <w:r>
+        <w:rPr>
           <w:b/>
           <w:bCs/>
         </w:rPr>
@@ -4264,15 +3667,7 @@
           <w:b/>
           <w:bCs/>
         </w:rPr>
-        <w:t xml:space="preserve"> </w:t>
-      </w:r>
-      <w:proofErr w:type="spellStart"/>
-      <w:r>
-        <w:rPr>
-          <w:b/>
-          <w:bCs/>
-        </w:rPr>
-        <w:t>StandUp</w:t>
+        <w:t xml:space="preserve"> StandUp</w:t>
       </w:r>
       <w:r>
         <w:rPr>
@@ -4281,7 +3676,6 @@
         </w:rPr>
         <w:t>s</w:t>
       </w:r>
-      <w:proofErr w:type="spellEnd"/>
       <w:r>
         <w:rPr>
           <w:b/>
@@ -4289,6 +3683,141 @@
         </w:rPr>
         <w:t xml:space="preserve">. </w:t>
       </w:r>
+    </w:p>
+    <w:p>
+      <w:pPr>
+        <w:pStyle w:val="ListParagraph"/>
+        <w:ind w:left="360"/>
+      </w:pPr>
+      <w:r>
+        <w:rPr>
+          <w:i/>
+          <w:iCs/>
+        </w:rPr>
+        <w:drawing>
+          <wp:anchor distT="0" distB="0" distL="114300" distR="114300" simplePos="0" relativeHeight="251662337" behindDoc="0" locked="0" layoutInCell="1" allowOverlap="1" wp14:anchorId="3A8FA2BE" wp14:editId="1609FE31">
+            <wp:simplePos x="0" y="0"/>
+            <wp:positionH relativeFrom="column">
+              <wp:posOffset>318770</wp:posOffset>
+            </wp:positionH>
+            <wp:positionV relativeFrom="paragraph">
+              <wp:posOffset>2168525</wp:posOffset>
+            </wp:positionV>
+            <wp:extent cx="2955290" cy="1813560"/>
+            <wp:effectExtent l="0" t="0" r="0" b="0"/>
+            <wp:wrapThrough wrapText="bothSides">
+              <wp:wrapPolygon edited="0">
+                <wp:start x="0" y="0"/>
+                <wp:lineTo x="0" y="21328"/>
+                <wp:lineTo x="21442" y="21328"/>
+                <wp:lineTo x="21442" y="0"/>
+                <wp:lineTo x="0" y="0"/>
+              </wp:wrapPolygon>
+            </wp:wrapThrough>
+            <wp:docPr id="1831463145" name="Picture 1" descr="A screenshot of a message&#10;&#10;AI-generated content may be incorrect."/>
+            <wp:cNvGraphicFramePr>
+              <a:graphicFrameLocks xmlns:a="http://schemas.openxmlformats.org/drawingml/2006/main" noChangeAspect="1"/>
+            </wp:cNvGraphicFramePr>
+            <a:graphic xmlns:a="http://schemas.openxmlformats.org/drawingml/2006/main">
+              <a:graphicData uri="http://schemas.openxmlformats.org/drawingml/2006/picture">
+                <pic:pic xmlns:pic="http://schemas.openxmlformats.org/drawingml/2006/picture">
+                  <pic:nvPicPr>
+                    <pic:cNvPr id="1831463145" name="Picture 1" descr="A screenshot of a message&#10;&#10;AI-generated content may be incorrect."/>
+                    <pic:cNvPicPr/>
+                  </pic:nvPicPr>
+                  <pic:blipFill>
+                    <a:blip r:embed="rId26">
+                      <a:extLst>
+                        <a:ext uri="{28A0092B-C50C-407E-A947-70E740481C1C}">
+                          <a14:useLocalDpi xmlns:a14="http://schemas.microsoft.com/office/drawing/2010/main" val="0"/>
+                        </a:ext>
+                      </a:extLst>
+                    </a:blip>
+                    <a:stretch>
+                      <a:fillRect/>
+                    </a:stretch>
+                  </pic:blipFill>
+                  <pic:spPr>
+                    <a:xfrm>
+                      <a:off x="0" y="0"/>
+                      <a:ext cx="2955290" cy="1813560"/>
+                    </a:xfrm>
+                    <a:prstGeom prst="rect">
+                      <a:avLst/>
+                    </a:prstGeom>
+                  </pic:spPr>
+                </pic:pic>
+              </a:graphicData>
+            </a:graphic>
+          </wp:anchor>
+        </w:drawing>
+      </w:r>
+      <w:r>
+        <w:drawing>
+          <wp:anchor distT="0" distB="0" distL="114300" distR="114300" simplePos="0" relativeHeight="251661313" behindDoc="0" locked="0" layoutInCell="1" allowOverlap="1" wp14:anchorId="0FC84D20" wp14:editId="732817E7">
+            <wp:simplePos x="0" y="0"/>
+            <wp:positionH relativeFrom="column">
+              <wp:posOffset>657062</wp:posOffset>
+            </wp:positionH>
+            <wp:positionV relativeFrom="paragraph">
+              <wp:posOffset>301625</wp:posOffset>
+            </wp:positionV>
+            <wp:extent cx="2527241" cy="1280056"/>
+            <wp:effectExtent l="0" t="0" r="6985" b="0"/>
+            <wp:wrapThrough wrapText="bothSides">
+              <wp:wrapPolygon edited="0">
+                <wp:start x="0" y="0"/>
+                <wp:lineTo x="0" y="21225"/>
+                <wp:lineTo x="21497" y="21225"/>
+                <wp:lineTo x="21497" y="0"/>
+                <wp:lineTo x="0" y="0"/>
+              </wp:wrapPolygon>
+            </wp:wrapThrough>
+            <wp:docPr id="1857723606" name="Picture 1" descr="A white paper with black text&#10;&#10;AI-generated content may be incorrect."/>
+            <wp:cNvGraphicFramePr>
+              <a:graphicFrameLocks xmlns:a="http://schemas.openxmlformats.org/drawingml/2006/main" noChangeAspect="1"/>
+            </wp:cNvGraphicFramePr>
+            <a:graphic xmlns:a="http://schemas.openxmlformats.org/drawingml/2006/main">
+              <a:graphicData uri="http://schemas.openxmlformats.org/drawingml/2006/picture">
+                <pic:pic xmlns:pic="http://schemas.openxmlformats.org/drawingml/2006/picture">
+                  <pic:nvPicPr>
+                    <pic:cNvPr id="1857723606" name="Picture 1" descr="A white paper with black text&#10;&#10;AI-generated content may be incorrect."/>
+                    <pic:cNvPicPr/>
+                  </pic:nvPicPr>
+                  <pic:blipFill>
+                    <a:blip r:embed="rId27" cstate="print">
+                      <a:extLst>
+                        <a:ext uri="{28A0092B-C50C-407E-A947-70E740481C1C}">
+                          <a14:useLocalDpi xmlns:a14="http://schemas.microsoft.com/office/drawing/2010/main" val="0"/>
+                        </a:ext>
+                      </a:extLst>
+                    </a:blip>
+                    <a:stretch>
+                      <a:fillRect/>
+                    </a:stretch>
+                  </pic:blipFill>
+                  <pic:spPr>
+                    <a:xfrm>
+                      <a:off x="0" y="0"/>
+                      <a:ext cx="2527241" cy="1280056"/>
+                    </a:xfrm>
+                    <a:prstGeom prst="rect">
+                      <a:avLst/>
+                    </a:prstGeom>
+                  </pic:spPr>
+                </pic:pic>
+              </a:graphicData>
+            </a:graphic>
+          </wp:anchor>
+        </w:drawing>
+      </w:r>
+      <w:r>
+        <w:rPr>
+          <w:b/>
+          <w:bCs/>
+        </w:rPr>
+        <w:t>maandag 5 Mei vrijedag*</w:t>
+      </w:r>
       <w:r>
         <w:rPr>
           <w:b/>
@@ -4297,12 +3826,51 @@
         <w:br/>
       </w:r>
       <w:r>
-        <w:rPr>
-          <w:i/>
-          <w:iCs/>
-        </w:rPr>
-        <w:t>…</w:t>
-      </w:r>
+        <w:drawing>
+          <wp:inline distT="0" distB="0" distL="0" distR="0" wp14:anchorId="79E957A1" wp14:editId="5D249D80">
+            <wp:extent cx="3046246" cy="1539240"/>
+            <wp:effectExtent l="0" t="0" r="1905" b="3810"/>
+            <wp:docPr id="1181276480" name="Picture 1" descr="A white paper with black text&#10;&#10;AI-generated content may be incorrect."/>
+            <wp:cNvGraphicFramePr>
+              <a:graphicFrameLocks xmlns:a="http://schemas.openxmlformats.org/drawingml/2006/main" noChangeAspect="1"/>
+            </wp:cNvGraphicFramePr>
+            <a:graphic xmlns:a="http://schemas.openxmlformats.org/drawingml/2006/main">
+              <a:graphicData uri="http://schemas.openxmlformats.org/drawingml/2006/picture">
+                <pic:pic xmlns:pic="http://schemas.openxmlformats.org/drawingml/2006/picture">
+                  <pic:nvPicPr>
+                    <pic:cNvPr id="1181276480" name="Picture 1" descr="A white paper with black text&#10;&#10;AI-generated content may be incorrect."/>
+                    <pic:cNvPicPr/>
+                  </pic:nvPicPr>
+                  <pic:blipFill>
+                    <a:blip r:embed="rId28"/>
+                    <a:stretch>
+                      <a:fillRect/>
+                    </a:stretch>
+                  </pic:blipFill>
+                  <pic:spPr>
+                    <a:xfrm>
+                      <a:off x="0" y="0"/>
+                      <a:ext cx="3046246" cy="1539240"/>
+                    </a:xfrm>
+                    <a:prstGeom prst="rect">
+                      <a:avLst/>
+                    </a:prstGeom>
+                  </pic:spPr>
+                </pic:pic>
+              </a:graphicData>
+            </a:graphic>
+          </wp:inline>
+        </w:drawing>
+      </w:r>
+    </w:p>
+    <w:p/>
+    <w:p/>
+    <w:p/>
+    <w:p>
+      <w:pPr>
+        <w:pStyle w:val="ListParagraph"/>
+        <w:ind w:left="360"/>
+      </w:pPr>
       <w:r>
         <w:rPr>
           <w:i/>
@@ -4324,6 +3892,7 @@
           <w:b/>
           <w:bCs/>
         </w:rPr>
+        <w:lastRenderedPageBreak/>
         <w:t xml:space="preserve">Wat is er </w:t>
       </w:r>
       <w:r>
@@ -4352,7 +3921,21 @@
           <w:i/>
           <w:iCs/>
         </w:rPr>
-        <w:t>…</w:t>
+        <w:t>in sprint 4 hebben wij verder gewerkt aan de obstacles en bugfixes aan verschillende scripts, denk hierbij aan null references bij een explosive car die een player object zoekt. Ook hebben wij gewerkt aan het verzamelen van de bewijsmaterialen</w:t>
+      </w:r>
+      <w:r>
+        <w:rPr>
+          <w:i/>
+          <w:iCs/>
+        </w:rPr>
+        <w:t xml:space="preserve"> zoals uml diagrammen en daarbij een sterke onderbouwing voor gemaakt. Aan het eind van sprint 4 hebben wij geprobeerd om een test scene in elkaar te zetten, dit was helaas niet optijd gelukt doordat er verschillende bugs uit de collision van objecten voortkwamen, uiteindelijk hebben wij dit wel kunnen fixen</w:t>
+      </w:r>
+      <w:r>
+        <w:rPr>
+          <w:i/>
+          <w:iCs/>
+        </w:rPr>
+        <w:t>.</w:t>
       </w:r>
       <w:r>
         <w:rPr>
@@ -4389,7 +3972,16 @@
           <w:i/>
           <w:iCs/>
         </w:rPr>
-        <w:t>…</w:t>
+        <w:t>een mogelijke uitdaging die wij kunnen tegenkomen is een gebrek aan communicatie waardoor er toch weer verschillende bugs kunnen ontstaan, net richting het einde zou het jammer zijn om veel bugs te krijgen door een gebrek aan communcatie.</w:t>
+      </w:r>
+    </w:p>
+    <w:p>
+      <w:pPr>
+        <w:pStyle w:val="ListParagraph"/>
+        <w:ind w:left="360"/>
+      </w:pPr>
+      <w:r>
+        <w:t>de oplossing is uiteraard zeggen wat je hebt gedaan aan het einde van een opdracht, hierdoor kunnen teamleden beter inschatten of zij bijvoorbeeld wel of geen ontrigger kunnen gebruiken en daardoor niet tijd verspillen door deze bug op te lossen.</w:t>
       </w:r>
       <w:r>
         <w:rPr>
@@ -4426,7 +4018,14 @@
           <w:i/>
           <w:iCs/>
         </w:rPr>
-        <w:t>…</w:t>
+        <w:t xml:space="preserve">deze periode was lastig, dit kwam doordat er veel vrije dagen en vakantie dagen tussendoor kwamen, hierdoor was het lastiger om het schema te volgen, een les die ik wel heb geleerd is om tijdens deze momenten meer te communiceren over taken </w:t>
+      </w:r>
+      <w:r>
+        <w:rPr>
+          <w:i/>
+          <w:iCs/>
+        </w:rPr>
+        <w:t>die we hebben gedaan en welke nog gedaan moeten worden, dit is handig om te doen om iedereen op de hoogte te houden over wat er nog te doen is, en wat al gedaan is (en werkt).</w:t>
       </w:r>
       <w:r>
         <w:rPr>
@@ -4463,7 +4062,7 @@
           <w:i/>
           <w:iCs/>
         </w:rPr>
-        <w:t>…</w:t>
+        <w:t>voor deze periode is het wat lastiger om tijd in te schatten doordat er veel vrije dagen zijn en bij de docenten veel besprekingen, hierdoor is het niet helemaal duidelijk hoeveel we af kunnen krijgen deze sprint</w:t>
       </w:r>
       <w:r>
         <w:rPr>
@@ -4524,7 +4123,20 @@
           <w:i/>
           <w:iCs/>
         </w:rPr>
-        <w:t>…</w:t>
+        <w:t>jorick heeft de test scene goed in elkaar gezet</w:t>
+      </w:r>
+    </w:p>
+    <w:p>
+      <w:pPr>
+        <w:pStyle w:val="ListParagraph"/>
+        <w:ind w:left="360"/>
+        <w:rPr>
+          <w:i/>
+          <w:iCs/>
+        </w:rPr>
+      </w:pPr>
+      <w:r>
+        <w:t>Jeroen heeft gezorgd voor een goeie soundtrack die past bij het spel</w:t>
       </w:r>
       <w:r>
         <w:rPr>
@@ -4579,7 +4191,14 @@
           <w:i/>
           <w:iCs/>
         </w:rPr>
-        <w:t>…</w:t>
+        <w:t>voor een eventuele volgende sprint is het handiger om wat meer te communiceren wanne</w:t>
+      </w:r>
+      <w:r>
+        <w:rPr>
+          <w:i/>
+          <w:iCs/>
+        </w:rPr>
+        <w:t>er we allemaal niet meer zo goed weten wat er wel en niet gedaan moet worden, dit zou kunnen in de vorm van een teamgesprek</w:t>
       </w:r>
       <w:r>
         <w:rPr>
@@ -4616,7 +4235,7 @@
           <w:i/>
           <w:iCs/>
         </w:rPr>
-        <w:t>…</w:t>
+        <w:t>deze periode was het allemaal wat on-overzichtelijk, dit kwam voornamelijk door de vakantie die midden in onze sprint was.</w:t>
       </w:r>
       <w:r>
         <w:rPr>
@@ -4653,7 +4272,16 @@
         <w:br/>
       </w:r>
       <w:r>
-        <w:t>…</w:t>
+        <w:t>voor volgende sprint moeten we de 1</w:t>
+      </w:r>
+      <w:r>
+        <w:rPr>
+          <w:vertAlign w:val="superscript"/>
+        </w:rPr>
+        <w:t>e</w:t>
+      </w:r>
+      <w:r>
+        <w:t xml:space="preserve"> map volledig werkend krijgen, hierbij moeten wij de obstakels een beetje tweaken en doormiddel van de spelerfeedback andere tweaks maken, denk hierbij bijvoorbeeld aan de stuur intensiteit en de acceleratie.</w:t>
       </w:r>
     </w:p>
     <w:p>
@@ -4665,9 +4293,9 @@
       </w:pPr>
     </w:p>
     <w:sectPr>
-      <w:footerReference w:type="default" r:id="rId25"/>
-      <w:headerReference w:type="first" r:id="rId26"/>
-      <w:footerReference w:type="first" r:id="rId27"/>
+      <w:footerReference w:type="default" r:id="rId29"/>
+      <w:headerReference w:type="first" r:id="rId30"/>
+      <w:footerReference w:type="first" r:id="rId31"/>
       <w:pgSz w:w="11906" w:h="16838"/>
       <w:pgMar w:top="1417" w:right="1417" w:bottom="1417" w:left="1417" w:header="708" w:footer="708" w:gutter="0"/>
       <w:cols w:space="708"/>
@@ -4819,7 +4447,6 @@
       </w:rPr>
       <w:t xml:space="preserve">             </w:t>
     </w:r>
-    <w:proofErr w:type="spellStart"/>
     <w:r>
       <w:rPr>
         <w:color w:val="000000"/>
@@ -4827,17 +4454,7 @@
         <w:szCs w:val="16"/>
         <w:lang w:val="en-US"/>
       </w:rPr>
-      <w:t>Sjabloon</w:t>
-    </w:r>
-    <w:proofErr w:type="spellEnd"/>
-    <w:r>
-      <w:rPr>
-        <w:color w:val="000000"/>
-        <w:sz w:val="16"/>
-        <w:szCs w:val="16"/>
-        <w:lang w:val="en-US"/>
-      </w:rPr>
-      <w:t xml:space="preserve"> </w:t>
+      <w:t xml:space="preserve">Sjabloon </w:t>
     </w:r>
     <w:r>
       <w:rPr>
@@ -10332,21 +9949,6 @@
 </file>
 
 <file path=customXml/item2.xml><?xml version="1.0" encoding="utf-8"?>
-<b:Sources xmlns:b="http://schemas.openxmlformats.org/officeDocument/2006/bibliography" xmlns="http://schemas.openxmlformats.org/officeDocument/2006/bibliography" SelectedStyle="\APASixthEditionOfficeOnline.xsl" StyleName="APA" Version="6"/>
-</file>
-
-<file path=customXml/item3.xml><?xml version="1.0" encoding="utf-8"?>
-<p:properties xmlns:p="http://schemas.microsoft.com/office/2006/metadata/properties" xmlns:xsi="http://www.w3.org/2001/XMLSchema-instance" xmlns:pc="http://schemas.microsoft.com/office/infopath/2007/PartnerControls">
-  <documentManagement>
-    <TaxCatchAll xmlns="32dd6115-ce5d-46b4-b638-9e7d5ca6cbee" xsi:nil="true"/>
-    <lcf76f155ced4ddcb4097134ff3c332f xmlns="094ecc41-7a37-40c9-8390-f18431712098">
-      <Terms xmlns="http://schemas.microsoft.com/office/infopath/2007/PartnerControls"/>
-    </lcf76f155ced4ddcb4097134ff3c332f>
-  </documentManagement>
-</p:properties>
-</file>
-
-<file path=customXml/item4.xml><?xml version="1.0" encoding="utf-8"?>
 <ct:contentTypeSchema xmlns:ct="http://schemas.microsoft.com/office/2006/metadata/contentType" xmlns:ma="http://schemas.microsoft.com/office/2006/metadata/properties/metaAttributes" ct:_="" ma:_="" ma:contentTypeName="Document" ma:contentTypeID="0x010100D5188FA4F7421B4A93E65E307A769E27" ma:contentTypeVersion="15" ma:contentTypeDescription="Een nieuw document maken." ma:contentTypeScope="" ma:versionID="9bfd002f47f5f7e7b2724518f3fad1a5">
   <xsd:schema xmlns:xsd="http://www.w3.org/2001/XMLSchema" xmlns:xs="http://www.w3.org/2001/XMLSchema" xmlns:p="http://schemas.microsoft.com/office/2006/metadata/properties" xmlns:ns2="094ecc41-7a37-40c9-8390-f18431712098" xmlns:ns3="32dd6115-ce5d-46b4-b638-9e7d5ca6cbee" targetNamespace="http://schemas.microsoft.com/office/2006/metadata/properties" ma:root="true" ma:fieldsID="e2c1118370456e9a6d2939e9bd0f2e89" ns2:_="" ns3:_="">
     <xsd:import namespace="094ecc41-7a37-40c9-8390-f18431712098"/>
@@ -10581,6 +10183,21 @@
 </ct:contentTypeSchema>
 </file>
 
+<file path=customXml/item3.xml><?xml version="1.0" encoding="utf-8"?>
+<p:properties xmlns:p="http://schemas.microsoft.com/office/2006/metadata/properties" xmlns:xsi="http://www.w3.org/2001/XMLSchema-instance" xmlns:pc="http://schemas.microsoft.com/office/infopath/2007/PartnerControls">
+  <documentManagement>
+    <TaxCatchAll xmlns="32dd6115-ce5d-46b4-b638-9e7d5ca6cbee" xsi:nil="true"/>
+    <lcf76f155ced4ddcb4097134ff3c332f xmlns="094ecc41-7a37-40c9-8390-f18431712098">
+      <Terms xmlns="http://schemas.microsoft.com/office/infopath/2007/PartnerControls"/>
+    </lcf76f155ced4ddcb4097134ff3c332f>
+  </documentManagement>
+</p:properties>
+</file>
+
+<file path=customXml/item4.xml><?xml version="1.0" encoding="utf-8"?>
+<b:Sources xmlns:b="http://schemas.openxmlformats.org/officeDocument/2006/bibliography" xmlns="http://schemas.openxmlformats.org/officeDocument/2006/bibliography" SelectedStyle="\APASixthEditionOfficeOnline.xsl" StyleName="APA" Version="6"/>
+</file>
+
 <file path=customXml/itemProps1.xml><?xml version="1.0" encoding="utf-8"?>
 <ds:datastoreItem xmlns:ds="http://schemas.openxmlformats.org/officeDocument/2006/customXml" ds:itemID="{C6916C6B-E06E-47CD-A094-BBBE44C5EA8C}">
   <ds:schemaRefs>
@@ -10590,9 +10207,20 @@
 </file>
 
 <file path=customXml/itemProps2.xml><?xml version="1.0" encoding="utf-8"?>
-<ds:datastoreItem xmlns:ds="http://schemas.openxmlformats.org/officeDocument/2006/customXml" ds:itemID="{72B7D650-2FAA-4D72-B587-235E59E6AC26}">
+<ds:datastoreItem xmlns:ds="http://schemas.openxmlformats.org/officeDocument/2006/customXml" ds:itemID="{7FB410C4-6DED-4E94-8F1E-FF9C8071DEDF}">
   <ds:schemaRefs>
-    <ds:schemaRef ds:uri="http://schemas.openxmlformats.org/officeDocument/2006/bibliography"/>
+    <ds:schemaRef ds:uri="http://schemas.microsoft.com/office/2006/metadata/contentType"/>
+    <ds:schemaRef ds:uri="http://schemas.microsoft.com/office/2006/metadata/properties/metaAttributes"/>
+    <ds:schemaRef ds:uri="http://www.w3.org/2001/XMLSchema"/>
+    <ds:schemaRef ds:uri="http://schemas.microsoft.com/office/2006/metadata/properties"/>
+    <ds:schemaRef ds:uri="094ecc41-7a37-40c9-8390-f18431712098"/>
+    <ds:schemaRef ds:uri="32dd6115-ce5d-46b4-b638-9e7d5ca6cbee"/>
+    <ds:schemaRef ds:uri="http://schemas.microsoft.com/office/2006/documentManagement/types"/>
+    <ds:schemaRef ds:uri="http://schemas.microsoft.com/office/infopath/2007/PartnerControls"/>
+    <ds:schemaRef ds:uri="http://schemas.openxmlformats.org/package/2006/metadata/core-properties"/>
+    <ds:schemaRef ds:uri="http://purl.org/dc/elements/1.1/"/>
+    <ds:schemaRef ds:uri="http://purl.org/dc/terms/"/>
+    <ds:schemaRef ds:uri="http://schemas.microsoft.com/internal/obd"/>
   </ds:schemaRefs>
 </ds:datastoreItem>
 </file>
@@ -10609,20 +10237,9 @@
 </file>
 
 <file path=customXml/itemProps4.xml><?xml version="1.0" encoding="utf-8"?>
-<ds:datastoreItem xmlns:ds="http://schemas.openxmlformats.org/officeDocument/2006/customXml" ds:itemID="{7FB410C4-6DED-4E94-8F1E-FF9C8071DEDF}">
+<ds:datastoreItem xmlns:ds="http://schemas.openxmlformats.org/officeDocument/2006/customXml" ds:itemID="{72B7D650-2FAA-4D72-B587-235E59E6AC26}">
   <ds:schemaRefs>
-    <ds:schemaRef ds:uri="http://schemas.microsoft.com/office/2006/metadata/contentType"/>
-    <ds:schemaRef ds:uri="http://schemas.microsoft.com/office/2006/metadata/properties/metaAttributes"/>
-    <ds:schemaRef ds:uri="http://www.w3.org/2001/XMLSchema"/>
-    <ds:schemaRef ds:uri="http://schemas.microsoft.com/office/2006/metadata/properties"/>
-    <ds:schemaRef ds:uri="094ecc41-7a37-40c9-8390-f18431712098"/>
-    <ds:schemaRef ds:uri="32dd6115-ce5d-46b4-b638-9e7d5ca6cbee"/>
-    <ds:schemaRef ds:uri="http://schemas.microsoft.com/office/2006/documentManagement/types"/>
-    <ds:schemaRef ds:uri="http://schemas.microsoft.com/office/infopath/2007/PartnerControls"/>
-    <ds:schemaRef ds:uri="http://schemas.openxmlformats.org/package/2006/metadata/core-properties"/>
-    <ds:schemaRef ds:uri="http://purl.org/dc/elements/1.1/"/>
-    <ds:schemaRef ds:uri="http://purl.org/dc/terms/"/>
-    <ds:schemaRef ds:uri="http://schemas.microsoft.com/internal/obd"/>
+    <ds:schemaRef ds:uri="http://schemas.openxmlformats.org/officeDocument/2006/bibliography"/>
   </ds:schemaRefs>
 </ds:datastoreItem>
 </file>
</xml_diff>